<commit_message>
Remarques chef PEC 2026-2027 : angady->trano, VFF, fambolena, RAM ; PE RPI/FCE/VOI + TeSI v2
Co-authored-by: arena-agent <297053741+arena-agent@users.noreply.github.com>
</commit_message>
<xml_diff>
--- a/pe-2026-2027/PE_FCE_2026_2027.docx
+++ b/pe-2026-2027/PE_FCE_2026_2027.docx
@@ -987,7 +987,7 @@
                 <w:b w:val="0"/>
                 <w:sz w:val="18"/>
               </w:rPr>
-              <w:t>Angady PM</w:t>
+              <w:t>Blanco Pen</w:t>
             </w:r>
           </w:p>
         </w:tc>
@@ -1008,7 +1008,7 @@
                 <w:b w:val="0"/>
                 <w:sz w:val="18"/>
               </w:rPr>
-              <w:t>5 000</w:t>
+              <w:t>2 000</w:t>
             </w:r>
           </w:p>
         </w:tc>
@@ -1029,7 +1029,7 @@
                 <w:b w:val="0"/>
                 <w:sz w:val="18"/>
               </w:rPr>
-              <w:t>2</w:t>
+              <w:t>6</w:t>
             </w:r>
           </w:p>
         </w:tc>
@@ -1050,7 +1050,149 @@
                 <w:b w:val="0"/>
                 <w:sz w:val="18"/>
               </w:rPr>
-              <w:t>10 000</w:t>
+              <w:t>12 000</w:t>
+            </w:r>
+          </w:p>
+        </w:tc>
+        <w:tc>
+          <w:tcPr>
+            <w:tcW w:type="dxa" w:w="1276"/>
+            <w:vMerge/>
+          </w:tcPr>
+          <w:p/>
+        </w:tc>
+        <w:tc>
+          <w:tcPr>
+            <w:tcW w:type="dxa" w:w="1276"/>
+            <w:vAlign w:val="center"/>
+          </w:tcPr>
+          <w:p>
+            <w:pPr>
+              <w:spacing w:after="0" w:before="0"/>
+              <w:jc w:val="left"/>
+            </w:pPr>
+            <w:r/>
+            <w:r>
+              <w:rPr>
+                <w:rFonts w:ascii="Times New Roman" w:hAnsi="Times New Roman"/>
+                <w:b w:val="0"/>
+                <w:sz w:val="18"/>
+              </w:rPr>
+              <w:t>(1/ens)</w:t>
+            </w:r>
+          </w:p>
+        </w:tc>
+      </w:tr>
+      <w:tr>
+        <w:tc>
+          <w:tcPr>
+            <w:tcW w:type="dxa" w:w="1276"/>
+            <w:vAlign w:val="center"/>
+          </w:tcPr>
+          <w:p>
+            <w:pPr>
+              <w:spacing w:after="0" w:before="0"/>
+              <w:jc w:val="center"/>
+            </w:pPr>
+            <w:r/>
+            <w:r>
+              <w:rPr>
+                <w:rFonts w:ascii="Times New Roman" w:hAnsi="Times New Roman"/>
+                <w:b w:val="0"/>
+                <w:sz w:val="18"/>
+              </w:rPr>
+              <w:t>5</w:t>
+            </w:r>
+          </w:p>
+        </w:tc>
+        <w:tc>
+          <w:tcPr>
+            <w:tcW w:type="dxa" w:w="1276"/>
+            <w:vMerge/>
+          </w:tcPr>
+          <w:p/>
+        </w:tc>
+        <w:tc>
+          <w:tcPr>
+            <w:tcW w:type="dxa" w:w="1276"/>
+            <w:vAlign w:val="center"/>
+          </w:tcPr>
+          <w:p>
+            <w:pPr>
+              <w:spacing w:after="0" w:before="0"/>
+              <w:jc w:val="left"/>
+            </w:pPr>
+            <w:r/>
+            <w:r>
+              <w:rPr>
+                <w:rFonts w:ascii="Times New Roman" w:hAnsi="Times New Roman"/>
+                <w:b w:val="0"/>
+                <w:sz w:val="18"/>
+              </w:rPr>
+              <w:t>Craie couleur RAFAFA</w:t>
+            </w:r>
+          </w:p>
+        </w:tc>
+        <w:tc>
+          <w:tcPr>
+            <w:tcW w:type="dxa" w:w="1276"/>
+            <w:vAlign w:val="center"/>
+          </w:tcPr>
+          <w:p>
+            <w:pPr>
+              <w:spacing w:after="0" w:before="0"/>
+              <w:jc w:val="center"/>
+            </w:pPr>
+            <w:r/>
+            <w:r>
+              <w:rPr>
+                <w:rFonts w:ascii="Times New Roman" w:hAnsi="Times New Roman"/>
+                <w:b w:val="0"/>
+                <w:sz w:val="18"/>
+              </w:rPr>
+              <w:t>6 000</w:t>
+            </w:r>
+          </w:p>
+        </w:tc>
+        <w:tc>
+          <w:tcPr>
+            <w:tcW w:type="dxa" w:w="1276"/>
+            <w:vAlign w:val="center"/>
+          </w:tcPr>
+          <w:p>
+            <w:pPr>
+              <w:spacing w:after="0" w:before="0"/>
+              <w:jc w:val="center"/>
+            </w:pPr>
+            <w:r/>
+            <w:r>
+              <w:rPr>
+                <w:rFonts w:ascii="Times New Roman" w:hAnsi="Times New Roman"/>
+                <w:b w:val="0"/>
+                <w:sz w:val="18"/>
+              </w:rPr>
+              <w:t>10</w:t>
+            </w:r>
+          </w:p>
+        </w:tc>
+        <w:tc>
+          <w:tcPr>
+            <w:tcW w:type="dxa" w:w="1276"/>
+            <w:vAlign w:val="center"/>
+          </w:tcPr>
+          <w:p>
+            <w:pPr>
+              <w:spacing w:after="0" w:before="0"/>
+              <w:jc w:val="center"/>
+            </w:pPr>
+            <w:r/>
+            <w:r>
+              <w:rPr>
+                <w:rFonts w:ascii="Times New Roman" w:hAnsi="Times New Roman"/>
+                <w:b w:val="0"/>
+                <w:sz w:val="18"/>
+              </w:rPr>
+              <w:t>60 000</w:t>
             </w:r>
           </w:p>
         </w:tc>
@@ -1100,7 +1242,304 @@
                 <w:b w:val="0"/>
                 <w:sz w:val="18"/>
               </w:rPr>
-              <w:t>5</w:t>
+              <w:t>6</w:t>
+            </w:r>
+          </w:p>
+        </w:tc>
+        <w:tc>
+          <w:tcPr>
+            <w:tcW w:type="dxa" w:w="1276"/>
+            <w:vMerge/>
+          </w:tcPr>
+          <w:p/>
+        </w:tc>
+        <w:tc>
+          <w:tcPr>
+            <w:tcW w:type="dxa" w:w="1276"/>
+            <w:vAlign w:val="center"/>
+          </w:tcPr>
+          <w:p>
+            <w:pPr>
+              <w:spacing w:after="0" w:before="0"/>
+              <w:jc w:val="left"/>
+            </w:pPr>
+            <w:r/>
+            <w:r>
+              <w:rPr>
+                <w:rFonts w:ascii="Times New Roman" w:hAnsi="Times New Roman"/>
+                <w:b w:val="0"/>
+                <w:sz w:val="18"/>
+              </w:rPr>
+              <w:t>Craie blanche RAFAFA</w:t>
+            </w:r>
+          </w:p>
+        </w:tc>
+        <w:tc>
+          <w:tcPr>
+            <w:tcW w:type="dxa" w:w="1276"/>
+            <w:vAlign w:val="center"/>
+          </w:tcPr>
+          <w:p>
+            <w:pPr>
+              <w:spacing w:after="0" w:before="0"/>
+              <w:jc w:val="center"/>
+            </w:pPr>
+            <w:r/>
+            <w:r>
+              <w:rPr>
+                <w:rFonts w:ascii="Times New Roman" w:hAnsi="Times New Roman"/>
+                <w:b w:val="0"/>
+                <w:sz w:val="18"/>
+              </w:rPr>
+              <w:t>5 000</w:t>
+            </w:r>
+          </w:p>
+        </w:tc>
+        <w:tc>
+          <w:tcPr>
+            <w:tcW w:type="dxa" w:w="1276"/>
+            <w:vAlign w:val="center"/>
+          </w:tcPr>
+          <w:p>
+            <w:pPr>
+              <w:spacing w:after="0" w:before="0"/>
+              <w:jc w:val="center"/>
+            </w:pPr>
+            <w:r/>
+            <w:r>
+              <w:rPr>
+                <w:rFonts w:ascii="Times New Roman" w:hAnsi="Times New Roman"/>
+                <w:b w:val="0"/>
+                <w:sz w:val="18"/>
+              </w:rPr>
+              <w:t>10</w:t>
+            </w:r>
+          </w:p>
+        </w:tc>
+        <w:tc>
+          <w:tcPr>
+            <w:tcW w:type="dxa" w:w="1276"/>
+            <w:vAlign w:val="center"/>
+          </w:tcPr>
+          <w:p>
+            <w:pPr>
+              <w:spacing w:after="0" w:before="0"/>
+              <w:jc w:val="center"/>
+            </w:pPr>
+            <w:r/>
+            <w:r>
+              <w:rPr>
+                <w:rFonts w:ascii="Times New Roman" w:hAnsi="Times New Roman"/>
+                <w:b w:val="0"/>
+                <w:sz w:val="18"/>
+              </w:rPr>
+              <w:t>50 000</w:t>
+            </w:r>
+          </w:p>
+        </w:tc>
+        <w:tc>
+          <w:tcPr>
+            <w:tcW w:type="dxa" w:w="1276"/>
+            <w:vMerge/>
+          </w:tcPr>
+          <w:p/>
+        </w:tc>
+        <w:tc>
+          <w:tcPr>
+            <w:tcW w:type="dxa" w:w="1276"/>
+            <w:vAlign w:val="center"/>
+          </w:tcPr>
+          <w:p>
+            <w:pPr>
+              <w:spacing w:after="0" w:before="0"/>
+              <w:jc w:val="left"/>
+            </w:pPr>
+            <w:r/>
+            <w:r>
+              <w:rPr>
+                <w:rFonts w:ascii="Times New Roman" w:hAnsi="Times New Roman"/>
+                <w:b w:val="0"/>
+                <w:sz w:val="18"/>
+              </w:rPr>
+            </w:r>
+          </w:p>
+        </w:tc>
+      </w:tr>
+      <w:tr>
+        <w:tc>
+          <w:tcPr>
+            <w:tcW w:type="dxa" w:w="1276"/>
+            <w:vAlign w:val="center"/>
+          </w:tcPr>
+          <w:p>
+            <w:pPr>
+              <w:spacing w:after="0" w:before="0"/>
+              <w:jc w:val="center"/>
+            </w:pPr>
+            <w:r/>
+            <w:r>
+              <w:rPr>
+                <w:rFonts w:ascii="Times New Roman" w:hAnsi="Times New Roman"/>
+                <w:b w:val="0"/>
+                <w:sz w:val="18"/>
+              </w:rPr>
+              <w:t>7</w:t>
+            </w:r>
+          </w:p>
+        </w:tc>
+        <w:tc>
+          <w:tcPr>
+            <w:tcW w:type="dxa" w:w="1276"/>
+            <w:vMerge w:val="restart"/>
+            <w:vAlign w:val="center"/>
+          </w:tcPr>
+          <w:p>
+            <w:pPr>
+              <w:spacing w:after="0" w:before="0"/>
+              <w:jc w:val="left"/>
+            </w:pPr>
+            <w:r/>
+            <w:r>
+              <w:rPr>
+                <w:rFonts w:ascii="Times New Roman" w:hAnsi="Times New Roman"/>
+                <w:b w:val="0"/>
+                <w:sz w:val="16"/>
+              </w:rPr>
+              <w:t>Tontolo ianarana / fitaovana (Fanamboarana trano)</w:t>
+            </w:r>
+          </w:p>
+        </w:tc>
+        <w:tc>
+          <w:tcPr>
+            <w:tcW w:type="dxa" w:w="1276"/>
+            <w:vAlign w:val="center"/>
+          </w:tcPr>
+          <w:p>
+            <w:pPr>
+              <w:spacing w:after="0" w:before="0"/>
+              <w:jc w:val="left"/>
+            </w:pPr>
+            <w:r/>
+            <w:r>
+              <w:rPr>
+                <w:rFonts w:ascii="Times New Roman" w:hAnsi="Times New Roman"/>
+                <w:b w:val="0"/>
+                <w:sz w:val="18"/>
+              </w:rPr>
+              <w:t>Ciment</w:t>
+            </w:r>
+          </w:p>
+        </w:tc>
+        <w:tc>
+          <w:tcPr>
+            <w:tcW w:type="dxa" w:w="1276"/>
+            <w:vAlign w:val="center"/>
+          </w:tcPr>
+          <w:p>
+            <w:pPr>
+              <w:spacing w:after="0" w:before="0"/>
+              <w:jc w:val="center"/>
+            </w:pPr>
+            <w:r/>
+            <w:r>
+              <w:rPr>
+                <w:rFonts w:ascii="Times New Roman" w:hAnsi="Times New Roman"/>
+                <w:b w:val="0"/>
+                <w:sz w:val="18"/>
+              </w:rPr>
+              <w:t>52 000</w:t>
+            </w:r>
+          </w:p>
+        </w:tc>
+        <w:tc>
+          <w:tcPr>
+            <w:tcW w:type="dxa" w:w="1276"/>
+            <w:vAlign w:val="center"/>
+          </w:tcPr>
+          <w:p>
+            <w:pPr>
+              <w:spacing w:after="0" w:before="0"/>
+              <w:jc w:val="center"/>
+            </w:pPr>
+            <w:r/>
+            <w:r>
+              <w:rPr>
+                <w:rFonts w:ascii="Times New Roman" w:hAnsi="Times New Roman"/>
+                <w:b w:val="0"/>
+                <w:sz w:val="18"/>
+              </w:rPr>
+              <w:t>1</w:t>
+            </w:r>
+          </w:p>
+        </w:tc>
+        <w:tc>
+          <w:tcPr>
+            <w:tcW w:type="dxa" w:w="1276"/>
+            <w:vAlign w:val="center"/>
+          </w:tcPr>
+          <w:p>
+            <w:pPr>
+              <w:spacing w:after="0" w:before="0"/>
+              <w:jc w:val="center"/>
+            </w:pPr>
+            <w:r/>
+            <w:r>
+              <w:rPr>
+                <w:rFonts w:ascii="Times New Roman" w:hAnsi="Times New Roman"/>
+                <w:b w:val="0"/>
+                <w:sz w:val="18"/>
+              </w:rPr>
+              <w:t>52 000</w:t>
+            </w:r>
+          </w:p>
+        </w:tc>
+        <w:tc>
+          <w:tcPr>
+            <w:tcW w:type="dxa" w:w="1276"/>
+            <w:vMerge/>
+          </w:tcPr>
+          <w:p/>
+        </w:tc>
+        <w:tc>
+          <w:tcPr>
+            <w:tcW w:type="dxa" w:w="1276"/>
+            <w:vAlign w:val="center"/>
+          </w:tcPr>
+          <w:p>
+            <w:pPr>
+              <w:spacing w:after="0" w:before="0"/>
+              <w:jc w:val="left"/>
+            </w:pPr>
+            <w:r/>
+            <w:r>
+              <w:rPr>
+                <w:rFonts w:ascii="Times New Roman" w:hAnsi="Times New Roman"/>
+                <w:b w:val="0"/>
+                <w:sz w:val="18"/>
+              </w:rPr>
+            </w:r>
+          </w:p>
+        </w:tc>
+      </w:tr>
+      <w:tr>
+        <w:tc>
+          <w:tcPr>
+            <w:tcW w:type="dxa" w:w="1276"/>
+            <w:vAlign w:val="center"/>
+          </w:tcPr>
+          <w:p>
+            <w:pPr>
+              <w:spacing w:after="0" w:before="0"/>
+              <w:jc w:val="center"/>
+            </w:pPr>
+            <w:r/>
+            <w:r>
+              <w:rPr>
+                <w:rFonts w:ascii="Times New Roman" w:hAnsi="Times New Roman"/>
+                <w:b w:val="0"/>
+                <w:sz w:val="18"/>
+              </w:rPr>
+              <w:t>8</w:t>
             </w:r>
           </w:p>
         </w:tc>
@@ -1241,7 +1680,7 @@
                 <w:b w:val="0"/>
                 <w:sz w:val="18"/>
               </w:rPr>
-              <w:t>6</w:t>
+              <w:t>9</w:t>
             </w:r>
           </w:p>
         </w:tc>
@@ -1269,290 +1708,7 @@
                 <w:b w:val="0"/>
                 <w:sz w:val="18"/>
               </w:rPr>
-              <w:t>Blanco Pen</w:t>
-            </w:r>
-          </w:p>
-        </w:tc>
-        <w:tc>
-          <w:tcPr>
-            <w:tcW w:type="dxa" w:w="1276"/>
-            <w:vAlign w:val="center"/>
-          </w:tcPr>
-          <w:p>
-            <w:pPr>
-              <w:spacing w:after="0" w:before="0"/>
-              <w:jc w:val="center"/>
-            </w:pPr>
-            <w:r/>
-            <w:r>
-              <w:rPr>
-                <w:rFonts w:ascii="Times New Roman" w:hAnsi="Times New Roman"/>
-                <w:b w:val="0"/>
-                <w:sz w:val="18"/>
-              </w:rPr>
-              <w:t>2 000</w:t>
-            </w:r>
-          </w:p>
-        </w:tc>
-        <w:tc>
-          <w:tcPr>
-            <w:tcW w:type="dxa" w:w="1276"/>
-            <w:vAlign w:val="center"/>
-          </w:tcPr>
-          <w:p>
-            <w:pPr>
-              <w:spacing w:after="0" w:before="0"/>
-              <w:jc w:val="center"/>
-            </w:pPr>
-            <w:r/>
-            <w:r>
-              <w:rPr>
-                <w:rFonts w:ascii="Times New Roman" w:hAnsi="Times New Roman"/>
-                <w:b w:val="0"/>
-                <w:sz w:val="18"/>
-              </w:rPr>
-              <w:t>6</w:t>
-            </w:r>
-          </w:p>
-        </w:tc>
-        <w:tc>
-          <w:tcPr>
-            <w:tcW w:type="dxa" w:w="1276"/>
-            <w:vAlign w:val="center"/>
-          </w:tcPr>
-          <w:p>
-            <w:pPr>
-              <w:spacing w:after="0" w:before="0"/>
-              <w:jc w:val="center"/>
-            </w:pPr>
-            <w:r/>
-            <w:r>
-              <w:rPr>
-                <w:rFonts w:ascii="Times New Roman" w:hAnsi="Times New Roman"/>
-                <w:b w:val="0"/>
-                <w:sz w:val="18"/>
-              </w:rPr>
-              <w:t>12 000</w:t>
-            </w:r>
-          </w:p>
-        </w:tc>
-        <w:tc>
-          <w:tcPr>
-            <w:tcW w:type="dxa" w:w="1276"/>
-            <w:vMerge/>
-          </w:tcPr>
-          <w:p/>
-        </w:tc>
-        <w:tc>
-          <w:tcPr>
-            <w:tcW w:type="dxa" w:w="1276"/>
-            <w:vAlign w:val="center"/>
-          </w:tcPr>
-          <w:p>
-            <w:pPr>
-              <w:spacing w:after="0" w:before="0"/>
-              <w:jc w:val="left"/>
-            </w:pPr>
-            <w:r/>
-            <w:r>
-              <w:rPr>
-                <w:rFonts w:ascii="Times New Roman" w:hAnsi="Times New Roman"/>
-                <w:b w:val="0"/>
-                <w:sz w:val="18"/>
-              </w:rPr>
-              <w:t>(1/ens)</w:t>
-            </w:r>
-          </w:p>
-        </w:tc>
-      </w:tr>
-      <w:tr>
-        <w:tc>
-          <w:tcPr>
-            <w:tcW w:type="dxa" w:w="1276"/>
-            <w:vAlign w:val="center"/>
-          </w:tcPr>
-          <w:p>
-            <w:pPr>
-              <w:spacing w:after="0" w:before="0"/>
-              <w:jc w:val="center"/>
-            </w:pPr>
-            <w:r/>
-            <w:r>
-              <w:rPr>
-                <w:rFonts w:ascii="Times New Roman" w:hAnsi="Times New Roman"/>
-                <w:b w:val="0"/>
-                <w:sz w:val="18"/>
-              </w:rPr>
-              <w:t>7</w:t>
-            </w:r>
-          </w:p>
-        </w:tc>
-        <w:tc>
-          <w:tcPr>
-            <w:tcW w:type="dxa" w:w="1276"/>
-            <w:vMerge/>
-          </w:tcPr>
-          <w:p/>
-        </w:tc>
-        <w:tc>
-          <w:tcPr>
-            <w:tcW w:type="dxa" w:w="1276"/>
-            <w:vAlign w:val="center"/>
-          </w:tcPr>
-          <w:p>
-            <w:pPr>
-              <w:spacing w:after="0" w:before="0"/>
-              <w:jc w:val="left"/>
-            </w:pPr>
-            <w:r/>
-            <w:r>
-              <w:rPr>
-                <w:rFonts w:ascii="Times New Roman" w:hAnsi="Times New Roman"/>
-                <w:b w:val="0"/>
-                <w:sz w:val="18"/>
-              </w:rPr>
-              <w:t>Craie couleur RAFAFA</w:t>
-            </w:r>
-          </w:p>
-        </w:tc>
-        <w:tc>
-          <w:tcPr>
-            <w:tcW w:type="dxa" w:w="1276"/>
-            <w:vAlign w:val="center"/>
-          </w:tcPr>
-          <w:p>
-            <w:pPr>
-              <w:spacing w:after="0" w:before="0"/>
-              <w:jc w:val="center"/>
-            </w:pPr>
-            <w:r/>
-            <w:r>
-              <w:rPr>
-                <w:rFonts w:ascii="Times New Roman" w:hAnsi="Times New Roman"/>
-                <w:b w:val="0"/>
-                <w:sz w:val="18"/>
-              </w:rPr>
-              <w:t>6 000</w:t>
-            </w:r>
-          </w:p>
-        </w:tc>
-        <w:tc>
-          <w:tcPr>
-            <w:tcW w:type="dxa" w:w="1276"/>
-            <w:vAlign w:val="center"/>
-          </w:tcPr>
-          <w:p>
-            <w:pPr>
-              <w:spacing w:after="0" w:before="0"/>
-              <w:jc w:val="center"/>
-            </w:pPr>
-            <w:r/>
-            <w:r>
-              <w:rPr>
-                <w:rFonts w:ascii="Times New Roman" w:hAnsi="Times New Roman"/>
-                <w:b w:val="0"/>
-                <w:sz w:val="18"/>
-              </w:rPr>
-              <w:t>10</w:t>
-            </w:r>
-          </w:p>
-        </w:tc>
-        <w:tc>
-          <w:tcPr>
-            <w:tcW w:type="dxa" w:w="1276"/>
-            <w:vAlign w:val="center"/>
-          </w:tcPr>
-          <w:p>
-            <w:pPr>
-              <w:spacing w:after="0" w:before="0"/>
-              <w:jc w:val="center"/>
-            </w:pPr>
-            <w:r/>
-            <w:r>
-              <w:rPr>
-                <w:rFonts w:ascii="Times New Roman" w:hAnsi="Times New Roman"/>
-                <w:b w:val="0"/>
-                <w:sz w:val="18"/>
-              </w:rPr>
-              <w:t>60 000</w:t>
-            </w:r>
-          </w:p>
-        </w:tc>
-        <w:tc>
-          <w:tcPr>
-            <w:tcW w:type="dxa" w:w="1276"/>
-            <w:vMerge/>
-          </w:tcPr>
-          <w:p/>
-        </w:tc>
-        <w:tc>
-          <w:tcPr>
-            <w:tcW w:type="dxa" w:w="1276"/>
-            <w:vAlign w:val="center"/>
-          </w:tcPr>
-          <w:p>
-            <w:pPr>
-              <w:spacing w:after="0" w:before="0"/>
-              <w:jc w:val="left"/>
-            </w:pPr>
-            <w:r/>
-            <w:r>
-              <w:rPr>
-                <w:rFonts w:ascii="Times New Roman" w:hAnsi="Times New Roman"/>
-                <w:b w:val="0"/>
-                <w:sz w:val="18"/>
-              </w:rPr>
-            </w:r>
-          </w:p>
-        </w:tc>
-      </w:tr>
-      <w:tr>
-        <w:tc>
-          <w:tcPr>
-            <w:tcW w:type="dxa" w:w="1276"/>
-            <w:vAlign w:val="center"/>
-          </w:tcPr>
-          <w:p>
-            <w:pPr>
-              <w:spacing w:after="0" w:before="0"/>
-              <w:jc w:val="center"/>
-            </w:pPr>
-            <w:r/>
-            <w:r>
-              <w:rPr>
-                <w:rFonts w:ascii="Times New Roman" w:hAnsi="Times New Roman"/>
-                <w:b w:val="0"/>
-                <w:sz w:val="18"/>
-              </w:rPr>
-              <w:t>8</w:t>
-            </w:r>
-          </w:p>
-        </w:tc>
-        <w:tc>
-          <w:tcPr>
-            <w:tcW w:type="dxa" w:w="1276"/>
-            <w:vMerge/>
-          </w:tcPr>
-          <w:p/>
-        </w:tc>
-        <w:tc>
-          <w:tcPr>
-            <w:tcW w:type="dxa" w:w="1276"/>
-            <w:vAlign w:val="center"/>
-          </w:tcPr>
-          <w:p>
-            <w:pPr>
-              <w:spacing w:after="0" w:before="0"/>
-              <w:jc w:val="left"/>
-            </w:pPr>
-            <w:r/>
-            <w:r>
-              <w:rPr>
-                <w:rFonts w:ascii="Times New Roman" w:hAnsi="Times New Roman"/>
-                <w:b w:val="0"/>
-                <w:sz w:val="18"/>
-              </w:rPr>
-              <w:t>Craie blanche RAFAFA</w:t>
+              <w:t>Angady PM</w:t>
             </w:r>
           </w:p>
         </w:tc>
@@ -1594,7 +1750,7 @@
                 <w:b w:val="0"/>
                 <w:sz w:val="18"/>
               </w:rPr>
-              <w:t>10</w:t>
+              <w:t>2</w:t>
             </w:r>
           </w:p>
         </w:tc>
@@ -1615,162 +1771,7 @@
                 <w:b w:val="0"/>
                 <w:sz w:val="18"/>
               </w:rPr>
-              <w:t>50 000</w:t>
-            </w:r>
-          </w:p>
-        </w:tc>
-        <w:tc>
-          <w:tcPr>
-            <w:tcW w:type="dxa" w:w="1276"/>
-            <w:vMerge/>
-          </w:tcPr>
-          <w:p/>
-        </w:tc>
-        <w:tc>
-          <w:tcPr>
-            <w:tcW w:type="dxa" w:w="1276"/>
-            <w:vAlign w:val="center"/>
-          </w:tcPr>
-          <w:p>
-            <w:pPr>
-              <w:spacing w:after="0" w:before="0"/>
-              <w:jc w:val="left"/>
-            </w:pPr>
-            <w:r/>
-            <w:r>
-              <w:rPr>
-                <w:rFonts w:ascii="Times New Roman" w:hAnsi="Times New Roman"/>
-                <w:b w:val="0"/>
-                <w:sz w:val="18"/>
-              </w:rPr>
-            </w:r>
-          </w:p>
-        </w:tc>
-      </w:tr>
-      <w:tr>
-        <w:tc>
-          <w:tcPr>
-            <w:tcW w:type="dxa" w:w="1276"/>
-            <w:vAlign w:val="center"/>
-          </w:tcPr>
-          <w:p>
-            <w:pPr>
-              <w:spacing w:after="0" w:before="0"/>
-              <w:jc w:val="center"/>
-            </w:pPr>
-            <w:r/>
-            <w:r>
-              <w:rPr>
-                <w:rFonts w:ascii="Times New Roman" w:hAnsi="Times New Roman"/>
-                <w:b w:val="0"/>
-                <w:sz w:val="18"/>
-              </w:rPr>
-              <w:t>9</w:t>
-            </w:r>
-          </w:p>
-        </w:tc>
-        <w:tc>
-          <w:tcPr>
-            <w:tcW w:type="dxa" w:w="1276"/>
-            <w:vAlign w:val="center"/>
-          </w:tcPr>
-          <w:p>
-            <w:pPr>
-              <w:spacing w:after="0" w:before="0"/>
-              <w:jc w:val="left"/>
-            </w:pPr>
-            <w:r/>
-            <w:r>
-              <w:rPr>
-                <w:rFonts w:ascii="Times New Roman" w:hAnsi="Times New Roman"/>
-                <w:b w:val="0"/>
-                <w:sz w:val="16"/>
-              </w:rPr>
-              <w:t>Tontolo ianarana / fitaovana</w:t>
-            </w:r>
-          </w:p>
-        </w:tc>
-        <w:tc>
-          <w:tcPr>
-            <w:tcW w:type="dxa" w:w="1276"/>
-            <w:vAlign w:val="center"/>
-          </w:tcPr>
-          <w:p>
-            <w:pPr>
-              <w:spacing w:after="0" w:before="0"/>
-              <w:jc w:val="left"/>
-            </w:pPr>
-            <w:r/>
-            <w:r>
-              <w:rPr>
-                <w:rFonts w:ascii="Times New Roman" w:hAnsi="Times New Roman"/>
-                <w:b w:val="0"/>
-                <w:sz w:val="18"/>
-              </w:rPr>
-              <w:t>Ciment</w:t>
-            </w:r>
-          </w:p>
-        </w:tc>
-        <w:tc>
-          <w:tcPr>
-            <w:tcW w:type="dxa" w:w="1276"/>
-            <w:vAlign w:val="center"/>
-          </w:tcPr>
-          <w:p>
-            <w:pPr>
-              <w:spacing w:after="0" w:before="0"/>
-              <w:jc w:val="center"/>
-            </w:pPr>
-            <w:r/>
-            <w:r>
-              <w:rPr>
-                <w:rFonts w:ascii="Times New Roman" w:hAnsi="Times New Roman"/>
-                <w:b w:val="0"/>
-                <w:sz w:val="18"/>
-              </w:rPr>
-              <w:t>52 000</w:t>
-            </w:r>
-          </w:p>
-        </w:tc>
-        <w:tc>
-          <w:tcPr>
-            <w:tcW w:type="dxa" w:w="1276"/>
-            <w:vAlign w:val="center"/>
-          </w:tcPr>
-          <w:p>
-            <w:pPr>
-              <w:spacing w:after="0" w:before="0"/>
-              <w:jc w:val="center"/>
-            </w:pPr>
-            <w:r/>
-            <w:r>
-              <w:rPr>
-                <w:rFonts w:ascii="Times New Roman" w:hAnsi="Times New Roman"/>
-                <w:b w:val="0"/>
-                <w:sz w:val="18"/>
-              </w:rPr>
-              <w:t>1</w:t>
-            </w:r>
-          </w:p>
-        </w:tc>
-        <w:tc>
-          <w:tcPr>
-            <w:tcW w:type="dxa" w:w="1276"/>
-            <w:vAlign w:val="center"/>
-          </w:tcPr>
-          <w:p>
-            <w:pPr>
-              <w:spacing w:after="0" w:before="0"/>
-              <w:jc w:val="center"/>
-            </w:pPr>
-            <w:r/>
-            <w:r>
-              <w:rPr>
-                <w:rFonts w:ascii="Times New Roman" w:hAnsi="Times New Roman"/>
-                <w:b w:val="0"/>
-                <w:sz w:val="18"/>
-              </w:rPr>
-              <w:t>52 000</w:t>
+              <w:t>10 000</w:t>
             </w:r>
           </w:p>
         </w:tc>

</xml_diff>